<commit_message>
Make "Prepared by" editable: custom positions, one or two officers
The positions under the Prepared by line are now editable per report, and
the second signer can be removed so a single officer prepares the report.
The template's underline and position lines became {{line:role}} and
{{title:role}} tokens (rebuilt with tools/build_post_activity_template.py).

Co-Authored-By: Claude Opus 5.5 <noreply@anthropic.com>
</commit_message>
<xml_diff>
--- a/templates/post_activity_report/template.docx
+++ b/templates/post_activity_report/template.docx
@@ -674,6 +674,9 @@
     <w:p>
       <w:pPr>
         <w:keepNext/>
+        <w:tabs>
+          <w:tab w:pos="4320" w:val="left"/>
+        </w:tabs>
         <w:spacing w:after="0"/>
         <w:jc w:val="both"/>
         <w:rPr>
@@ -690,22 +693,17 @@
           <w:szCs w:val="24"/>
           <w:lang w:val="en-US"/>
         </w:rPr>
-        <w:t>__________________________________</w:t>
-      </w:r>
-      <w:r>
-        <w:rPr>
-          <w:rFonts w:ascii="Aptos" w:hAnsi="Aptos"/>
-          <w:sz w:val="24"/>
-          <w:szCs w:val="24"/>
-          <w:lang w:val="en-US"/>
-        </w:rPr>
+        <w:t>{{line:president}}</w:t>
         <w:tab/>
-        <w:t>_____________________________________</w:t>
+        <w:t>{{line:secretary}}</w:t>
       </w:r>
     </w:p>
     <w:p>
       <w:pPr>
         <w:keepNext/>
+        <w:tabs>
+          <w:tab w:pos="4320" w:val="left"/>
+        </w:tabs>
         <w:spacing w:after="0"/>
         <w:jc w:val="both"/>
         <w:rPr>
@@ -726,73 +724,9 @@
           <w:szCs w:val="24"/>
           <w:lang w:val="en-US"/>
         </w:rPr>
-        <w:t>President</w:t>
-      </w:r>
-      <w:r>
-        <w:rPr>
-          <w:rFonts w:ascii="Aptos" w:hAnsi="Aptos"/>
-          <w:i/>
-          <w:iCs/>
-          <w:sz w:val="24"/>
-          <w:szCs w:val="24"/>
-          <w:lang w:val="en-US"/>
-        </w:rPr>
+        <w:t>{{title:president}}</w:t>
         <w:tab/>
-      </w:r>
-      <w:r>
-        <w:rPr>
-          <w:rFonts w:ascii="Aptos" w:hAnsi="Aptos"/>
-          <w:i/>
-          <w:iCs/>
-          <w:sz w:val="24"/>
-          <w:szCs w:val="24"/>
-          <w:lang w:val="en-US"/>
-        </w:rPr>
-        <w:tab/>
-      </w:r>
-      <w:r>
-        <w:rPr>
-          <w:rFonts w:ascii="Aptos" w:hAnsi="Aptos"/>
-          <w:i/>
-          <w:iCs/>
-          <w:sz w:val="24"/>
-          <w:szCs w:val="24"/>
-          <w:lang w:val="en-US"/>
-        </w:rPr>
-        <w:tab/>
-      </w:r>
-      <w:r>
-        <w:rPr>
-          <w:rFonts w:ascii="Aptos" w:hAnsi="Aptos"/>
-          <w:i/>
-          <w:iCs/>
-          <w:sz w:val="24"/>
-          <w:szCs w:val="24"/>
-          <w:lang w:val="en-US"/>
-        </w:rPr>
-        <w:tab/>
-      </w:r>
-      <w:r>
-        <w:rPr>
-          <w:rFonts w:ascii="Aptos" w:hAnsi="Aptos"/>
-          <w:i/>
-          <w:iCs/>
-          <w:sz w:val="24"/>
-          <w:szCs w:val="24"/>
-          <w:lang w:val="en-US"/>
-        </w:rPr>
-        <w:tab/>
-      </w:r>
-      <w:r>
-        <w:rPr>
-          <w:rFonts w:ascii="Aptos" w:hAnsi="Aptos"/>
-          <w:i/>
-          <w:iCs/>
-          <w:sz w:val="24"/>
-          <w:szCs w:val="24"/>
-          <w:lang w:val="en-US"/>
-        </w:rPr>
-        <w:t>Secretary</w:t>
+        <w:t>{{title:secretary}}</w:t>
       </w:r>
     </w:p>
     <w:p>

</xml_diff>